<commit_message>
Fix cover summary formatting; fit two photo-summary blocks per page
- 'See the Results table on page N…': the page number and the rest of the sentence now use the
  cell's 10 pt font; the page number is a complex PAGEREF field with \* MERGEFORMAT so Word
  keeps that size when it recalculates (a simple field reverted to 12 pt)
- Cover summary paragraphs are left-aligned (they inherited 'justify' from the style)
- Photo summary: each block has a fixed height (4.3in) so exactly two fit per page, including
  the first page under the heading. Rows have exact heights and can't split; the image row is
  kept with its comments. The comments get the height their text needs (0.75-1.6in) with the
  font stepping down from 9 to 7 pt for long text; the image fills the rest, scaled to fit
  while keeping its proportions
- Checked in Word: 7 blocks with comments from 6 to 1,176 characters land two per page with
  none split

Co-Authored-By: Claude Opus 5.5 <noreply@anthropic.com>
</commit_message>
<xml_diff>
--- a/word_templates/paut_master.docx
+++ b/word_templates/paut_master.docx
@@ -968,6 +968,7 @@
                 <w:tab w:val="left" w:pos="-720"/>
               </w:tabs>
               <w:suppressAutoHyphens/>
+              <w:jc w:val="left"/>
               <w:rPr>
                 <w:color w:val="000000"/>
                 <w:spacing w:val="-2"/>
@@ -988,6 +989,7 @@
               </w:tabs>
               <w:suppressAutoHyphens/>
               <w:spacing w:after="0"/>
+              <w:jc w:val="left"/>
               <w:rPr>
                 <w:b/>
                 <w:color w:val="000000"/>
@@ -1012,6 +1014,7 @@
               </w:tabs>
               <w:suppressAutoHyphens/>
               <w:spacing w:after="0"/>
+              <w:jc w:val="left"/>
               <w:rPr>
                 <w:bCs/>
                 <w:color w:val="000000"/>
@@ -1035,6 +1038,7 @@
                 <w:tab w:val="left" w:pos="-720"/>
               </w:tabs>
               <w:suppressAutoHyphens/>
+              <w:jc w:val="left"/>
               <w:rPr>
                 <w:sz w:val="20"/>
               </w:rPr>
@@ -1045,12 +1049,40 @@
               </w:rPr>
               <w:t xml:space="preserve">See the Results table on page </w:t>
             </w:r>
-            <w:fldSimple w:instr=" PAGEREF _Toc239168045 \h ">
-              <w:r>
-                <w:t/>
-              </w:r>
-            </w:fldSimple>
-            <w:r>
+            <w:r>
+              <w:rPr>
+                <w:sz w:val="20"/>
+              </w:rPr>
+              <w:fldChar w:fldCharType="begin"/>
+            </w:r>
+            <w:r>
+              <w:rPr>
+                <w:sz w:val="20"/>
+              </w:rPr>
+              <w:instrText xml:space="preserve"> PAGEREF _Toc239168045 \h \* MERGEFORMAT </w:instrText>
+            </w:r>
+            <w:r>
+              <w:rPr>
+                <w:sz w:val="20"/>
+              </w:rPr>
+              <w:fldChar w:fldCharType="separate"/>
+            </w:r>
+            <w:r>
+              <w:rPr>
+                <w:sz w:val="20"/>
+              </w:rPr>
+              <w:t/>
+            </w:r>
+            <w:r>
+              <w:rPr>
+                <w:sz w:val="20"/>
+              </w:rPr>
+              <w:fldChar w:fldCharType="end"/>
+            </w:r>
+            <w:r>
+              <w:rPr>
+                <w:sz w:val="20"/>
+              </w:rPr>
               <w:t xml:space="preserve"> of this report for details of each individual scan area.</w:t>
             </w:r>
           </w:p>
@@ -4899,7 +4931,8 @@
       </w:tblGrid>
       <w:tr>
         <w:trPr>
-          <w:trHeight w:val="4968"/>
+          <w:cantSplit/>
+          <w:trHeight w:val="{{ r.image_twips }}" w:hRule="exact"/>
           <w:jc w:val="center"/>
         </w:trPr>
         <w:tc>
@@ -4910,6 +4943,7 @@
           </w:tcPr>
           <w:p>
             <w:pPr>
+              <w:keepNext/>
               <w:spacing w:after="0"/>
               <w:jc w:val="center"/>
               <w:rPr>
@@ -4925,7 +4959,8 @@
       </w:tr>
       <w:tr>
         <w:trPr>
-          <w:trHeight w:val="1081"/>
+          <w:cantSplit/>
+          <w:trHeight w:val="{{ r.comments_twips }}" w:hRule="exact"/>
           <w:jc w:val="center"/>
         </w:trPr>
         <w:tc>
@@ -4995,8 +5030,8 @@
             <w:r>
               <w:rPr>
                 <w:rFonts w:ascii="Times New Roman" w:hAnsi="Times New Roman" w:cs="Times New Roman"/>
-                <w:sz w:val="18"/>
-                <w:szCs w:val="18"/>
+                <w:sz w:val="{{ r.comment_half_points }}"/>
+                <w:szCs w:val="{{ r.comment_half_points }}"/>
               </w:rPr>
               <w:t>{{ r.comments }}</w:t>
             </w:r>

</xml_diff>

<commit_message>
Cover personnel: name and certification on one line, left-aligned
'Lucas Jennings / Ultrasonic Level II' instead of the name and certification on two lines
(the slash is left out when there is no certification), and the Prepared / Examined /
Reviewed cells are left-aligned instead of inheriting 'justify'. Checked in Word: each person
fits on one line in the 2.1in cell.

Co-Authored-By: Claude Opus 5.5 <noreply@anthropic.com>
</commit_message>
<xml_diff>
--- a/word_templates/paut_master.docx
+++ b/word_templates/paut_master.docx
@@ -1157,6 +1157,9 @@
             </w:r>
           </w:p>
           <w:p>
+            <w:pPr>
+              <w:jc w:val="left"/>
+            </w:pPr>
             <w:r>
               <w:t>{%p for p in prepared_by %}</w:t>
             </w:r>
@@ -1176,12 +1179,13 @@
                 <w:rFonts w:ascii="Times New Roman" w:hAnsi="Times New Roman"/>
                 <w:szCs w:val="18"/>
               </w:rPr>
-              <w:t>{{ p.name }}</w:t>
-              <w:br/>
-              <w:t>{{ p.certification }}</w:t>
-            </w:r>
-          </w:p>
-          <w:p>
+              <w:t>{{ p.name }}{% if p.certification %} / {{ p.certification }}{% endif %}</w:t>
+            </w:r>
+          </w:p>
+          <w:p>
+            <w:pPr>
+              <w:jc w:val="left"/>
+            </w:pPr>
             <w:r>
               <w:t>{%p endfor %}</w:t>
             </w:r>
@@ -1340,6 +1344,7 @@
             <w:pPr>
               <w:pStyle w:val="Summary2"/>
               <w:spacing w:before="0" w:after="0"/>
+              <w:jc w:val="left"/>
               <w:rPr>
                 <w:i/>
                 <w:sz w:val="18"/>
@@ -1356,6 +1361,9 @@
             </w:r>
           </w:p>
           <w:p>
+            <w:pPr>
+              <w:jc w:val="left"/>
+            </w:pPr>
             <w:r>
               <w:t>{%p for p in examined_by %}</w:t>
             </w:r>
@@ -1364,6 +1372,7 @@
             <w:pPr>
               <w:pStyle w:val="Summary2"/>
               <w:spacing w:before="0" w:after="0"/>
+              <w:jc w:val="left"/>
               <w:rPr>
                 <w:i/>
                 <w:sz w:val="18"/>
@@ -1376,12 +1385,13 @@
                 <w:sz w:val="18"/>
                 <w:szCs w:val="18"/>
               </w:rPr>
-              <w:t>{{ p.name }}</w:t>
-              <w:br/>
-              <w:t>{{ p.certification }}</w:t>
-            </w:r>
-          </w:p>
-          <w:p>
+              <w:t>{{ p.name }}{% if p.certification %} / {{ p.certification }}{% endif %}</w:t>
+            </w:r>
+          </w:p>
+          <w:p>
+            <w:pPr>
+              <w:jc w:val="left"/>
+            </w:pPr>
             <w:r>
               <w:t>{%p endfor %}</w:t>
             </w:r>
@@ -1521,6 +1531,9 @@
             </w:r>
           </w:p>
           <w:p>
+            <w:pPr>
+              <w:jc w:val="left"/>
+            </w:pPr>
             <w:r>
               <w:t>{%p for p in reviewed_by %}</w:t>
             </w:r>
@@ -1546,6 +1559,9 @@
             </w:r>
           </w:p>
           <w:p>
+            <w:pPr>
+              <w:jc w:val="left"/>
+            </w:pPr>
             <w:r>
               <w:t>{%p endfor %}</w:t>
             </w:r>

</xml_diff>